<commit_message>
Replacing CountryID with TerritoryID in Customer Table
</commit_message>
<xml_diff>
--- a/Phase_1/Documentation/Schema Documentation&ERD.docx
+++ b/Phase_1/Documentation/Schema Documentation&ERD.docx
@@ -833,19 +833,23 @@
       </w:pPr>
       <w:proofErr w:type="spellStart"/>
       <w:r>
-        <w:t>CountryID</w:t>
+        <w:t>Territory</w:t>
+      </w:r>
+      <w:r>
+        <w:t>ID</w:t>
       </w:r>
       <w:proofErr w:type="spellEnd"/>
       <w:r>
         <w:t xml:space="preserve"> (int) — Constraint: Foreign Key references </w:t>
       </w:r>
-      <w:proofErr w:type="gramStart"/>
-      <w:r>
-        <w:t>Country(</w:t>
-      </w:r>
-      <w:proofErr w:type="gramEnd"/>
-      <w:r>
-        <w:t>ID). Cannot be NULL.</w:t>
+      <w:r>
+        <w:t>Territory</w:t>
+      </w:r>
+      <w:r>
+        <w:t xml:space="preserve"> </w:t>
+      </w:r>
+      <w:r>
+        <w:t>(ID). Cannot be NULL.</w:t>
       </w:r>
     </w:p>
     <w:p>
@@ -3674,23 +3678,15 @@
       <w:pPr>
         <w:jc w:val="center"/>
       </w:pPr>
-    </w:p>
-    <w:p/>
-    <w:p/>
-    <w:p/>
-    <w:p>
-      <w:pPr>
-        <w:jc w:val="center"/>
-      </w:pPr>
       <w:r>
         <w:rPr>
           <w:noProof/>
         </w:rPr>
         <w:drawing>
-          <wp:inline distT="0" distB="0" distL="0" distR="0" wp14:anchorId="7A2F375B" wp14:editId="52C35FB6">
-            <wp:extent cx="4750874" cy="6581775"/>
-            <wp:effectExtent l="0" t="0" r="0" b="0"/>
-            <wp:docPr id="2" name="Picture 2"/>
+          <wp:inline distT="0" distB="0" distL="0" distR="0" wp14:anchorId="0385614B" wp14:editId="161024A2">
+            <wp:extent cx="6051784" cy="7180028"/>
+            <wp:effectExtent l="0" t="0" r="6350" b="1905"/>
+            <wp:docPr id="3" name="Picture 3"/>
             <wp:cNvGraphicFramePr>
               <a:graphicFrameLocks xmlns:a="http://schemas.openxmlformats.org/drawingml/2006/main" noChangeAspect="1"/>
             </wp:cNvGraphicFramePr>
@@ -3698,13 +3694,13 @@
               <a:graphicData uri="http://schemas.openxmlformats.org/drawingml/2006/picture">
                 <pic:pic xmlns:pic="http://schemas.openxmlformats.org/drawingml/2006/picture">
                   <pic:nvPicPr>
-                    <pic:cNvPr id="0" name="Picture 1"/>
+                    <pic:cNvPr id="0" name="Picture 2"/>
                     <pic:cNvPicPr>
                       <a:picLocks noChangeAspect="1" noChangeArrowheads="1"/>
                     </pic:cNvPicPr>
                   </pic:nvPicPr>
                   <pic:blipFill>
-                    <a:blip r:embed="rId4">
+                    <a:blip r:embed="rId4" cstate="print">
                       <a:extLst>
                         <a:ext uri="{28A0092B-C50C-407E-A947-70E740481C1C}">
                           <a14:useLocalDpi xmlns:a14="http://schemas.microsoft.com/office/drawing/2010/main" val="0"/>
@@ -3719,7 +3715,7 @@
                   <pic:spPr bwMode="auto">
                     <a:xfrm>
                       <a:off x="0" y="0"/>
-                      <a:ext cx="4753161" cy="6584944"/>
+                      <a:ext cx="6068933" cy="7200374"/>
                     </a:xfrm>
                     <a:prstGeom prst="rect">
                       <a:avLst/>

</xml_diff>